<commit_message>
Update README, architecture doc, technical report, and website
Co-Authored-By: Claude Sonnet 4.6 <noreply@anthropic.com>
</commit_message>
<xml_diff>
--- a/docs/CodeSentinel_Technical_Report.docx
+++ b/docs/CodeSentinel_Technical_Report.docx
@@ -196,7 +196,7 @@
     </w:p>
     <w:p>
       <w:pPr>
-        <w:spacing w:after="480"/>
+        <w:spacing w:after="320"/>
         <w:jc w:val="center"/>
       </w:pPr>
       <w:r>
@@ -234,7 +234,7 @@
           <w:sz w:val="20"/>
           <w:szCs w:val="20"/>
         </w:rPr>
-        <w:t xml:space="preserve">Repository  </w:t>
+        <w:t xml:space="preserve">Website  </w:t>
       </w:r>
       <w:r>
         <w:rPr>
@@ -243,12 +243,12 @@
           <w:sz w:val="20"/>
           <w:szCs w:val="20"/>
         </w:rPr>
-        <w:t xml:space="preserve">github.com/AravindB98/CodeSentinel</w:t>
-      </w:r>
-    </w:p>
-    <w:p>
-      <w:pPr>
-        <w:spacing w:after="0"/>
+        <w:t xml:space="preserve">aravindb98.github.io/CodeSentinel</w:t>
+      </w:r>
+    </w:p>
+    <w:p>
+      <w:pPr>
+        <w:spacing w:after="60"/>
         <w:jc w:val="center"/>
       </w:pPr>
       <w:r>
@@ -260,7 +260,7 @@
           <w:sz w:val="20"/>
           <w:szCs w:val="20"/>
         </w:rPr>
-        <w:t xml:space="preserve">Live demo  </w:t>
+        <w:t xml:space="preserve">Repository  </w:t>
       </w:r>
       <w:r>
         <w:rPr>
@@ -269,7 +269,59 @@
           <w:sz w:val="20"/>
           <w:szCs w:val="20"/>
         </w:rPr>
+        <w:t xml:space="preserve">github.com/AravindB98/CodeSentinel</w:t>
+      </w:r>
+    </w:p>
+    <w:p>
+      <w:pPr>
+        <w:spacing w:after="60"/>
+        <w:jc w:val="center"/>
+      </w:pPr>
+      <w:r>
+        <w:rPr>
+          <w:rFonts w:ascii="Calibri" w:cs="Calibri" w:eastAsia="Calibri" w:hAnsi="Calibri"/>
+          <w:b/>
+          <w:bCs/>
+          <w:color w:val="D97706"/>
+          <w:sz w:val="20"/>
+          <w:szCs w:val="20"/>
+        </w:rPr>
+        <w:t xml:space="preserve">Live demo  </w:t>
+      </w:r>
+      <w:r>
+        <w:rPr>
+          <w:rFonts w:ascii="Consolas" w:cs="Consolas" w:eastAsia="Consolas" w:hAnsi="Consolas"/>
+          <w:color w:val="1A1C17"/>
+          <w:sz w:val="20"/>
+          <w:szCs w:val="20"/>
+        </w:rPr>
         <w:t xml:space="preserve">codesentinel-f2ggdvqeuwsj4pta5sk27s.streamlit.app</w:t>
+      </w:r>
+    </w:p>
+    <w:p>
+      <w:pPr>
+        <w:spacing w:after="0"/>
+        <w:jc w:val="center"/>
+      </w:pPr>
+      <w:r>
+        <w:rPr>
+          <w:rFonts w:ascii="Calibri" w:cs="Calibri" w:eastAsia="Calibri" w:hAnsi="Calibri"/>
+          <w:b/>
+          <w:bCs/>
+          <w:color w:val="D97706"/>
+          <w:sz w:val="20"/>
+          <w:szCs w:val="20"/>
+        </w:rPr>
+        <w:t xml:space="preserve">Video (7 min)  </w:t>
+      </w:r>
+      <w:r>
+        <w:rPr>
+          <w:rFonts w:ascii="Consolas" w:cs="Consolas" w:eastAsia="Consolas" w:hAnsi="Consolas"/>
+          <w:color w:val="1A1C17"/>
+          <w:sz w:val="20"/>
+          <w:szCs w:val="20"/>
+        </w:rPr>
+        <w:t xml:space="preserve">youtu.be/do8GvAK7tHI</w:t>
       </w:r>
     </w:p>
     <w:p>
@@ -10241,6 +10293,448 @@
           <w:szCs w:val="22"/>
         </w:rPr>
         <w:t xml:space="preserve">The underlying claim is broader than the specific system: when an LLM application is rearchitected into specialized, grounded, adversarially-reviewed agents, the gains come from the architecture, not from the model, and they compose with any model the field produces next. That claim is what the measurements in Section 10 establish, within the bounded scope specified by the non-objectives in Section 2.3. The extensions proposed in Section 13 span near-term engineering, a five-plus-agent production architecture, research questions sized for a 12-to-18-month program, and a concrete commercialization path — all of which follow from the same architecture without requiring it to be redesigned.</w:t>
+      </w:r>
+    </w:p>
+    <w:p>
+      <w:pPr>
+        <w:spacing w:after="120"/>
+      </w:pPr>
+      <w:r>
+        <w:t xml:space="preserve"/>
+      </w:r>
+    </w:p>
+    <w:p>
+      <w:pPr>
+        <w:pStyle w:val="Heading2"/>
+        <w:keepNext/>
+        <w:spacing w:after="180" w:before="320"/>
+      </w:pPr>
+      <w:r>
+        <w:rPr>
+          <w:rFonts w:ascii="Calibri" w:cs="Calibri" w:eastAsia="Calibri" w:hAnsi="Calibri"/>
+          <w:b/>
+          <w:bCs/>
+          <w:color w:val="C2410C"/>
+          <w:sz w:val="26"/>
+          <w:szCs w:val="26"/>
+        </w:rPr>
+        <w:t xml:space="preserve">Project Artifacts and Companion Links</w:t>
+      </w:r>
+    </w:p>
+    <w:p>
+      <w:pPr>
+        <w:spacing w:after="140" w:before="0" w:line="320"/>
+        <w:jc w:val="both"/>
+      </w:pPr>
+      <w:r>
+        <w:rPr>
+          <w:rFonts w:ascii="Calibri" w:cs="Calibri" w:eastAsia="Calibri" w:hAnsi="Calibri"/>
+          <w:b w:val="false"/>
+          <w:bCs w:val="false"/>
+          <w:i w:val="false"/>
+          <w:iCs w:val="false"/>
+          <w:color w:val="1A1C17"/>
+          <w:sz w:val="22"/>
+          <w:szCs w:val="22"/>
+        </w:rPr>
+        <w:t xml:space="preserve">Every claim in this report is backed by an artifact the reader can inspect independently. Four companion resources are published alongside the repository.</w:t>
+      </w:r>
+    </w:p>
+    <w:tbl>
+      <w:tblPr>
+        <w:tblW w:type="dxa" w:w="9360"/>
+        <w:tblBorders>
+          <w:top w:val="single" w:color="auto" w:sz="4"/>
+          <w:left w:val="single" w:color="auto" w:sz="4"/>
+          <w:bottom w:val="single" w:color="auto" w:sz="4"/>
+          <w:right w:val="single" w:color="auto" w:sz="4"/>
+          <w:insideH w:val="single" w:color="auto" w:sz="4"/>
+          <w:insideV w:val="single" w:color="auto" w:sz="4"/>
+        </w:tblBorders>
+      </w:tblPr>
+      <w:tblGrid>
+        <w:gridCol w:w="4680"/>
+        <w:gridCol w:w="4680"/>
+      </w:tblGrid>
+      <w:tr>
+        <w:trPr>
+          <w:tblHeader/>
+        </w:trPr>
+        <w:tc>
+          <w:tcPr>
+            <w:tcW w:type="dxa" w:w="4680"/>
+            <w:tcBorders>
+              <w:top w:val="single" w:color="C9C6B8" w:sz="2"/>
+              <w:left w:val="single" w:color="C9C6B8" w:sz="2"/>
+              <w:bottom w:val="single" w:color="C9C6B8" w:sz="2"/>
+              <w:right w:val="single" w:color="C9C6B8" w:sz="2"/>
+            </w:tcBorders>
+            <w:shd w:fill="FFF4E3" w:val="clear"/>
+            <w:tcMar>
+              <w:top w:type="dxa" w:w="100"/>
+              <w:left w:type="dxa" w:w="140"/>
+              <w:bottom w:type="dxa" w:w="100"/>
+              <w:right w:type="dxa" w:w="140"/>
+            </w:tcMar>
+          </w:tcPr>
+          <w:p>
+            <w:pPr>
+              <w:jc w:val="center"/>
+            </w:pPr>
+            <w:r>
+              <w:rPr>
+                <w:rFonts w:ascii="Calibri" w:cs="Calibri" w:eastAsia="Calibri" w:hAnsi="Calibri"/>
+                <w:b/>
+                <w:bCs/>
+                <w:color w:val="D97706"/>
+                <w:sz w:val="20"/>
+                <w:szCs w:val="20"/>
+              </w:rPr>
+              <w:t xml:space="preserve">Artifact</w:t>
+            </w:r>
+          </w:p>
+        </w:tc>
+        <w:tc>
+          <w:tcPr>
+            <w:tcW w:type="dxa" w:w="4680"/>
+            <w:tcBorders>
+              <w:top w:val="single" w:color="C9C6B8" w:sz="2"/>
+              <w:left w:val="single" w:color="C9C6B8" w:sz="2"/>
+              <w:bottom w:val="single" w:color="C9C6B8" w:sz="2"/>
+              <w:right w:val="single" w:color="C9C6B8" w:sz="2"/>
+            </w:tcBorders>
+            <w:shd w:fill="FFF4E3" w:val="clear"/>
+            <w:tcMar>
+              <w:top w:type="dxa" w:w="100"/>
+              <w:left w:type="dxa" w:w="140"/>
+              <w:bottom w:type="dxa" w:w="100"/>
+              <w:right w:type="dxa" w:w="140"/>
+            </w:tcMar>
+          </w:tcPr>
+          <w:p>
+            <w:pPr>
+              <w:jc w:val="center"/>
+            </w:pPr>
+            <w:r>
+              <w:rPr>
+                <w:rFonts w:ascii="Calibri" w:cs="Calibri" w:eastAsia="Calibri" w:hAnsi="Calibri"/>
+                <w:b/>
+                <w:bCs/>
+                <w:color w:val="D97706"/>
+                <w:sz w:val="20"/>
+                <w:szCs w:val="20"/>
+              </w:rPr>
+              <w:t xml:space="preserve">URL</w:t>
+            </w:r>
+          </w:p>
+        </w:tc>
+      </w:tr>
+      <w:tr>
+        <w:tc>
+          <w:tcPr>
+            <w:tcW w:type="dxa" w:w="4680"/>
+            <w:tcBorders>
+              <w:top w:val="single" w:color="C9C6B8" w:sz="2"/>
+              <w:left w:val="single" w:color="C9C6B8" w:sz="2"/>
+              <w:bottom w:val="single" w:color="C9C6B8" w:sz="2"/>
+              <w:right w:val="single" w:color="C9C6B8" w:sz="2"/>
+            </w:tcBorders>
+            <w:shd w:fill="FFFFFF" w:val="clear"/>
+            <w:tcMar>
+              <w:top w:type="dxa" w:w="80"/>
+              <w:left w:type="dxa" w:w="140"/>
+              <w:bottom w:type="dxa" w:w="80"/>
+              <w:right w:type="dxa" w:w="140"/>
+            </w:tcMar>
+          </w:tcPr>
+          <w:p>
+            <w:pPr>
+              <w:jc w:val="center"/>
+            </w:pPr>
+            <w:r>
+              <w:rPr>
+                <w:rFonts w:ascii="Calibri" w:cs="Calibri" w:eastAsia="Calibri" w:hAnsi="Calibri"/>
+                <w:b w:val="false"/>
+                <w:bCs w:val="false"/>
+                <w:color w:val="1A1C17"/>
+                <w:sz w:val="20"/>
+                <w:szCs w:val="20"/>
+              </w:rPr>
+              <w:t xml:space="preserve">Project website</w:t>
+            </w:r>
+          </w:p>
+        </w:tc>
+        <w:tc>
+          <w:tcPr>
+            <w:tcW w:type="dxa" w:w="4680"/>
+            <w:tcBorders>
+              <w:top w:val="single" w:color="C9C6B8" w:sz="2"/>
+              <w:left w:val="single" w:color="C9C6B8" w:sz="2"/>
+              <w:bottom w:val="single" w:color="C9C6B8" w:sz="2"/>
+              <w:right w:val="single" w:color="C9C6B8" w:sz="2"/>
+            </w:tcBorders>
+            <w:shd w:fill="FFFFFF" w:val="clear"/>
+            <w:tcMar>
+              <w:top w:type="dxa" w:w="80"/>
+              <w:left w:type="dxa" w:w="140"/>
+              <w:bottom w:type="dxa" w:w="80"/>
+              <w:right w:type="dxa" w:w="140"/>
+            </w:tcMar>
+          </w:tcPr>
+          <w:p>
+            <w:pPr>
+              <w:jc w:val="center"/>
+            </w:pPr>
+            <w:r>
+              <w:rPr>
+                <w:rFonts w:ascii="Calibri" w:cs="Calibri" w:eastAsia="Calibri" w:hAnsi="Calibri"/>
+                <w:b w:val="false"/>
+                <w:bCs w:val="false"/>
+                <w:color w:val="1A1C17"/>
+                <w:sz w:val="20"/>
+                <w:szCs w:val="20"/>
+              </w:rPr>
+              <w:t xml:space="preserve">aravindb98.github.io/CodeSentinel</w:t>
+            </w:r>
+          </w:p>
+        </w:tc>
+      </w:tr>
+      <w:tr>
+        <w:tc>
+          <w:tcPr>
+            <w:tcW w:type="dxa" w:w="4680"/>
+            <w:tcBorders>
+              <w:top w:val="single" w:color="C9C6B8" w:sz="2"/>
+              <w:left w:val="single" w:color="C9C6B8" w:sz="2"/>
+              <w:bottom w:val="single" w:color="C9C6B8" w:sz="2"/>
+              <w:right w:val="single" w:color="C9C6B8" w:sz="2"/>
+            </w:tcBorders>
+            <w:shd w:fill="F0EFE8" w:val="clear"/>
+            <w:tcMar>
+              <w:top w:type="dxa" w:w="80"/>
+              <w:left w:type="dxa" w:w="140"/>
+              <w:bottom w:type="dxa" w:w="80"/>
+              <w:right w:type="dxa" w:w="140"/>
+            </w:tcMar>
+          </w:tcPr>
+          <w:p>
+            <w:pPr>
+              <w:jc w:val="center"/>
+            </w:pPr>
+            <w:r>
+              <w:rPr>
+                <w:rFonts w:ascii="Calibri" w:cs="Calibri" w:eastAsia="Calibri" w:hAnsi="Calibri"/>
+                <w:b w:val="false"/>
+                <w:bCs w:val="false"/>
+                <w:color w:val="1A1C17"/>
+                <w:sz w:val="20"/>
+                <w:szCs w:val="20"/>
+              </w:rPr>
+              <w:t xml:space="preserve">GitHub repository</w:t>
+            </w:r>
+          </w:p>
+        </w:tc>
+        <w:tc>
+          <w:tcPr>
+            <w:tcW w:type="dxa" w:w="4680"/>
+            <w:tcBorders>
+              <w:top w:val="single" w:color="C9C6B8" w:sz="2"/>
+              <w:left w:val="single" w:color="C9C6B8" w:sz="2"/>
+              <w:bottom w:val="single" w:color="C9C6B8" w:sz="2"/>
+              <w:right w:val="single" w:color="C9C6B8" w:sz="2"/>
+            </w:tcBorders>
+            <w:shd w:fill="F0EFE8" w:val="clear"/>
+            <w:tcMar>
+              <w:top w:type="dxa" w:w="80"/>
+              <w:left w:type="dxa" w:w="140"/>
+              <w:bottom w:type="dxa" w:w="80"/>
+              <w:right w:type="dxa" w:w="140"/>
+            </w:tcMar>
+          </w:tcPr>
+          <w:p>
+            <w:pPr>
+              <w:jc w:val="center"/>
+            </w:pPr>
+            <w:r>
+              <w:rPr>
+                <w:rFonts w:ascii="Calibri" w:cs="Calibri" w:eastAsia="Calibri" w:hAnsi="Calibri"/>
+                <w:b w:val="false"/>
+                <w:bCs w:val="false"/>
+                <w:color w:val="1A1C17"/>
+                <w:sz w:val="20"/>
+                <w:szCs w:val="20"/>
+              </w:rPr>
+              <w:t xml:space="preserve">github.com/AravindB98/CodeSentinel</w:t>
+            </w:r>
+          </w:p>
+        </w:tc>
+      </w:tr>
+      <w:tr>
+        <w:tc>
+          <w:tcPr>
+            <w:tcW w:type="dxa" w:w="4680"/>
+            <w:tcBorders>
+              <w:top w:val="single" w:color="C9C6B8" w:sz="2"/>
+              <w:left w:val="single" w:color="C9C6B8" w:sz="2"/>
+              <w:bottom w:val="single" w:color="C9C6B8" w:sz="2"/>
+              <w:right w:val="single" w:color="C9C6B8" w:sz="2"/>
+            </w:tcBorders>
+            <w:shd w:fill="FFFFFF" w:val="clear"/>
+            <w:tcMar>
+              <w:top w:type="dxa" w:w="80"/>
+              <w:left w:type="dxa" w:w="140"/>
+              <w:bottom w:type="dxa" w:w="80"/>
+              <w:right w:type="dxa" w:w="140"/>
+            </w:tcMar>
+          </w:tcPr>
+          <w:p>
+            <w:pPr>
+              <w:jc w:val="center"/>
+            </w:pPr>
+            <w:r>
+              <w:rPr>
+                <w:rFonts w:ascii="Calibri" w:cs="Calibri" w:eastAsia="Calibri" w:hAnsi="Calibri"/>
+                <w:b w:val="false"/>
+                <w:bCs w:val="false"/>
+                <w:color w:val="1A1C17"/>
+                <w:sz w:val="20"/>
+                <w:szCs w:val="20"/>
+              </w:rPr>
+              <w:t xml:space="preserve">Live Streamlit demo</w:t>
+            </w:r>
+          </w:p>
+        </w:tc>
+        <w:tc>
+          <w:tcPr>
+            <w:tcW w:type="dxa" w:w="4680"/>
+            <w:tcBorders>
+              <w:top w:val="single" w:color="C9C6B8" w:sz="2"/>
+              <w:left w:val="single" w:color="C9C6B8" w:sz="2"/>
+              <w:bottom w:val="single" w:color="C9C6B8" w:sz="2"/>
+              <w:right w:val="single" w:color="C9C6B8" w:sz="2"/>
+            </w:tcBorders>
+            <w:shd w:fill="FFFFFF" w:val="clear"/>
+            <w:tcMar>
+              <w:top w:type="dxa" w:w="80"/>
+              <w:left w:type="dxa" w:w="140"/>
+              <w:bottom w:type="dxa" w:w="80"/>
+              <w:right w:type="dxa" w:w="140"/>
+            </w:tcMar>
+          </w:tcPr>
+          <w:p>
+            <w:pPr>
+              <w:jc w:val="center"/>
+            </w:pPr>
+            <w:r>
+              <w:rPr>
+                <w:rFonts w:ascii="Calibri" w:cs="Calibri" w:eastAsia="Calibri" w:hAnsi="Calibri"/>
+                <w:b w:val="false"/>
+                <w:bCs w:val="false"/>
+                <w:color w:val="1A1C17"/>
+                <w:sz w:val="20"/>
+                <w:szCs w:val="20"/>
+              </w:rPr>
+              <w:t xml:space="preserve">codesentinel-f2ggdvqeuwsj4pta5sk27s.streamlit.app</w:t>
+            </w:r>
+          </w:p>
+        </w:tc>
+      </w:tr>
+      <w:tr>
+        <w:tc>
+          <w:tcPr>
+            <w:tcW w:type="dxa" w:w="4680"/>
+            <w:tcBorders>
+              <w:top w:val="single" w:color="C9C6B8" w:sz="2"/>
+              <w:left w:val="single" w:color="C9C6B8" w:sz="2"/>
+              <w:bottom w:val="single" w:color="C9C6B8" w:sz="2"/>
+              <w:right w:val="single" w:color="C9C6B8" w:sz="2"/>
+            </w:tcBorders>
+            <w:shd w:fill="F0EFE8" w:val="clear"/>
+            <w:tcMar>
+              <w:top w:type="dxa" w:w="80"/>
+              <w:left w:type="dxa" w:w="140"/>
+              <w:bottom w:type="dxa" w:w="80"/>
+              <w:right w:type="dxa" w:w="140"/>
+            </w:tcMar>
+          </w:tcPr>
+          <w:p>
+            <w:pPr>
+              <w:jc w:val="center"/>
+            </w:pPr>
+            <w:r>
+              <w:rPr>
+                <w:rFonts w:ascii="Calibri" w:cs="Calibri" w:eastAsia="Calibri" w:hAnsi="Calibri"/>
+                <w:b w:val="false"/>
+                <w:bCs w:val="false"/>
+                <w:color w:val="1A1C17"/>
+                <w:sz w:val="20"/>
+                <w:szCs w:val="20"/>
+              </w:rPr>
+              <w:t xml:space="preserve">Video walkthrough (7 min)</w:t>
+            </w:r>
+          </w:p>
+        </w:tc>
+        <w:tc>
+          <w:tcPr>
+            <w:tcW w:type="dxa" w:w="4680"/>
+            <w:tcBorders>
+              <w:top w:val="single" w:color="C9C6B8" w:sz="2"/>
+              <w:left w:val="single" w:color="C9C6B8" w:sz="2"/>
+              <w:bottom w:val="single" w:color="C9C6B8" w:sz="2"/>
+              <w:right w:val="single" w:color="C9C6B8" w:sz="2"/>
+            </w:tcBorders>
+            <w:shd w:fill="F0EFE8" w:val="clear"/>
+            <w:tcMar>
+              <w:top w:type="dxa" w:w="80"/>
+              <w:left w:type="dxa" w:w="140"/>
+              <w:bottom w:type="dxa" w:w="80"/>
+              <w:right w:type="dxa" w:w="140"/>
+            </w:tcMar>
+          </w:tcPr>
+          <w:p>
+            <w:pPr>
+              <w:jc w:val="center"/>
+            </w:pPr>
+            <w:r>
+              <w:rPr>
+                <w:rFonts w:ascii="Calibri" w:cs="Calibri" w:eastAsia="Calibri" w:hAnsi="Calibri"/>
+                <w:b w:val="false"/>
+                <w:bCs w:val="false"/>
+                <w:color w:val="1A1C17"/>
+                <w:sz w:val="20"/>
+                <w:szCs w:val="20"/>
+              </w:rPr>
+              <w:t xml:space="preserve">youtu.be/do8GvAK7tHI</w:t>
+            </w:r>
+          </w:p>
+        </w:tc>
+      </w:tr>
+    </w:tbl>
+    <w:p>
+      <w:pPr>
+        <w:spacing w:after="120"/>
+      </w:pPr>
+      <w:r>
+        <w:t xml:space="preserve"/>
+      </w:r>
+    </w:p>
+    <w:p>
+      <w:pPr>
+        <w:spacing w:after="140" w:before="0" w:line="320"/>
+        <w:jc w:val="both"/>
+      </w:pPr>
+      <w:r>
+        <w:rPr>
+          <w:rFonts w:ascii="Calibri" w:cs="Calibri" w:eastAsia="Calibri" w:hAnsi="Calibri"/>
+          <w:b w:val="false"/>
+          <w:bCs w:val="false"/>
+          <w:i w:val="false"/>
+          <w:iCs w:val="false"/>
+          <w:color w:val="1A1C17"/>
+          <w:sz w:val="22"/>
+          <w:szCs w:val="22"/>
+        </w:rPr>
+        <w:t xml:space="preserve">The project website hosts the showcase page with the same warm-orange and sindoor palette used throughout this report. The GitHub repository contains all 30 Python source files, the 35-sample test suite, the RAG corpus, the RL demonstration modules, the benchmark harness, and the committed April 20, 2026 real-LLM results under eval/results/20260420_143220/. The Streamlit deployment runs the full three-agent pipeline against real Claude Sonnet — per-call costs run on a personal API account as disclosed in Section 11.7. The YouTube video is a seven-minute walkthrough covering the architecture, the live demo, the thirty-to-one false-positive result, and the bug the system caught before the author did.</w:t>
       </w:r>
     </w:p>
     <w:p>

</xml_diff>